<commit_message>
Add OOPs notes (M01-M21) + Bit Manipulation; update ML SD docx
</commit_message>
<xml_diff>
--- a/ML_System_Design/ML_SD_M01_Foundations.docx
+++ b/ML_System_Design/ML_SD_M01_Foundations.docx
@@ -1035,7 +1035,7 @@
       <w:r>
         <w:drawing>
           <wp:inline>
-            <wp:extent cx="5334000" cy="2750170"/>
+            <wp:extent cx="5727700" cy="2953159"/>
             <wp:effectExtent b="0" l="0" r="0" t="0"/>
             <wp:docPr descr="Top: Software 1.0 — humans write the rules. Bottom: Software 2.0 — we give data plus answers and the machine learns the rules (the model)." title="" id="11" name="Picture"/>
             <a:graphic>
@@ -1056,7 +1056,7 @@
                   <pic:spPr bwMode="auto">
                     <a:xfrm>
                       <a:off x="0" y="0"/>
-                      <a:ext cx="5334000" cy="2750170"/>
+                      <a:ext cx="5727700" cy="2953159"/>
                     </a:xfrm>
                     <a:prstGeom prst="rect">
                       <a:avLst/>
@@ -1479,7 +1479,7 @@
       <w:r>
         <w:drawing>
           <wp:inline>
-            <wp:extent cx="5334000" cy="2750170"/>
+            <wp:extent cx="5727700" cy="2953159"/>
             <wp:effectExtent b="0" l="0" r="0" t="0"/>
             <wp:docPr descr="Decision flowchart: if a simple rule solves it, use rules; only use ML when patterns exist, data exists, and some error is acceptable." title="" id="17" name="Picture"/>
             <a:graphic>
@@ -1500,7 +1500,7 @@
                   <pic:spPr bwMode="auto">
                     <a:xfrm>
                       <a:off x="0" y="0"/>
-                      <a:ext cx="5334000" cy="2750170"/>
+                      <a:ext cx="5727700" cy="2953159"/>
                     </a:xfrm>
                     <a:prstGeom prst="rect">
                       <a:avLst/>
@@ -1765,7 +1765,7 @@
       <w:r>
         <w:drawing>
           <wp:inline>
-            <wp:extent cx="5334000" cy="2748265"/>
+            <wp:extent cx="5727700" cy="2951114"/>
             <wp:effectExtent b="0" l="0" r="0" t="0"/>
             <wp:docPr descr="Classic systems have deterministic logic and fixed behaviour. ML systems add probabilistic outputs, “good-enough” metrics, decay over time, and richer testing." title="" id="22" name="Picture"/>
             <a:graphic>
@@ -1786,7 +1786,7 @@
                   <pic:spPr bwMode="auto">
                     <a:xfrm>
                       <a:off x="0" y="0"/>
-                      <a:ext cx="5334000" cy="2748265"/>
+                      <a:ext cx="5727700" cy="2951114"/>
                     </a:xfrm>
                     <a:prstGeom prst="rect">
                       <a:avLst/>
@@ -2313,7 +2313,7 @@
       <w:r>
         <w:drawing>
           <wp:inline>
-            <wp:extent cx="5334000" cy="2505363"/>
+            <wp:extent cx="5727700" cy="2690283"/>
             <wp:effectExtent b="0" l="0" r="0" t="0"/>
             <wp:docPr descr="The ML model code is the small orange box; the real work is the large surrounding infrastructure — data, features, serving, monitoring, configuration." title="" id="27" name="Picture"/>
             <a:graphic>
@@ -2334,7 +2334,7 @@
                   <pic:spPr bwMode="auto">
                     <a:xfrm>
                       <a:off x="0" y="0"/>
-                      <a:ext cx="5334000" cy="2505363"/>
+                      <a:ext cx="5727700" cy="2690283"/>
                     </a:xfrm>
                     <a:prstGeom prst="rect">
                       <a:avLst/>
@@ -2756,7 +2756,7 @@
       <w:r>
         <w:drawing>
           <wp:inline>
-            <wp:extent cx="5334000" cy="2750170"/>
+            <wp:extent cx="5727700" cy="2953159"/>
             <wp:effectExtent b="0" l="0" r="0" t="0"/>
             <wp:docPr descr="The seven-stage ML lifecycle drawn as a loop; monitoring feeds fresh data back to the start so the model can be retrained as the world drifts." title="" id="33" name="Picture"/>
             <a:graphic>
@@ -2777,7 +2777,7 @@
                   <pic:spPr bwMode="auto">
                     <a:xfrm>
                       <a:off x="0" y="0"/>
-                      <a:ext cx="5334000" cy="2750170"/>
+                      <a:ext cx="5727700" cy="2953159"/>
                     </a:xfrm>
                     <a:prstGeom prst="rect">
                       <a:avLst/>
@@ -3215,7 +3215,7 @@
       <w:r>
         <w:drawing>
           <wp:inline>
-            <wp:extent cx="5334000" cy="2272907"/>
+            <wp:extent cx="5727700" cy="2440669"/>
             <wp:effectExtent b="0" l="0" r="0" t="0"/>
             <wp:docPr descr="The data flywheel: a better product attracts more users, who generate more data, which trains a better model, which improves the product." title="" id="38" name="Picture"/>
             <a:graphic>
@@ -3236,7 +3236,7 @@
                   <pic:spPr bwMode="auto">
                     <a:xfrm>
                       <a:off x="0" y="0"/>
-                      <a:ext cx="5334000" cy="2272907"/>
+                      <a:ext cx="5727700" cy="2440669"/>
                     </a:xfrm>
                     <a:prstGeom prst="rect">
                       <a:avLst/>
@@ -3575,7 +3575,7 @@
       <w:r>
         <w:drawing>
           <wp:inline>
-            <wp:extent cx="5334000" cy="2750170"/>
+            <wp:extent cx="5727700" cy="2953159"/>
             <wp:effectExtent b="0" l="0" r="0" t="0"/>
             <wp:docPr descr="Four types of ML systems by where inference runs: batch (offline), online (real-time), streaming, and on-device/federated, with example use cases." title="" id="44" name="Picture"/>
             <a:graphic>
@@ -3596,7 +3596,7 @@
                   <pic:spPr bwMode="auto">
                     <a:xfrm>
                       <a:off x="0" y="0"/>
-                      <a:ext cx="5334000" cy="2750170"/>
+                      <a:ext cx="5727700" cy="2953159"/>
                     </a:xfrm>
                     <a:prstGeom prst="rect">
                       <a:avLst/>
@@ -5470,7 +5470,7 @@
       <w:r>
         <w:drawing>
           <wp:inline>
-            <wp:extent cx="5334000" cy="2750170"/>
+            <wp:extent cx="5727700" cy="2953159"/>
             <wp:effectExtent b="0" l="0" r="0" t="0"/>
             <wp:docPr descr="A 2x2 of mistake cost vs volume: low-stakes ship fast; high-stakes rare needs human review; high-stakes high-volume (fraud) demands caution." title="" id="58" name="Picture"/>
             <a:graphic>
@@ -5491,7 +5491,7 @@
                   <pic:spPr bwMode="auto">
                     <a:xfrm>
                       <a:off x="0" y="0"/>
-                      <a:ext cx="5334000" cy="2750170"/>
+                      <a:ext cx="5727700" cy="2953159"/>
                     </a:xfrm>
                     <a:prstGeom prst="rect">
                       <a:avLst/>
@@ -8263,6 +8263,8 @@
       <w:footnotePr>
         <w:numRestart w:val="eachSect"/>
       </w:footnotePr>
+      <w:pgSz w:h="16838" w:w="11906"/>
+      <w:pgMar w:bottom="1440" w:footer="720" w:gutter="0" w:header="720" w:left="1440" w:right="1440" w:top="1440"/>
     </w:sectPr>
   </w:body>
 </w:document>

</xml_diff>